<commit_message>
updated format and added few features needs testing
</commit_message>
<xml_diff>
--- a/reference.docx
+++ b/reference.docx
@@ -1,6 +1,6 @@
 
 <file path=word/document.xml><?xml version="1.0" encoding="utf-8"?>
-<w:document xmlns:w="http://schemas.openxmlformats.org/wordprocessingml/2006/main" xmlns:m="http://schemas.openxmlformats.org/officeDocument/2006/math" xmlns:r="http://schemas.openxmlformats.org/officeDocument/2006/relationships" xmlns:o="urn:schemas-microsoft-com:office:office" xmlns:v="urn:schemas-microsoft-com:vml" xmlns:w10="urn:schemas-microsoft-com:office:word" xmlns:a="http://schemas.openxmlformats.org/drawingml/2006/main" xmlns:pic="http://schemas.openxmlformats.org/drawingml/2006/picture" xmlns:wp="http://schemas.openxmlformats.org/drawingml/2006/wordprocessingDrawing">
+<w:document xmlns:r="http://schemas.openxmlformats.org/officeDocument/2006/relationships" xmlns:w="http://schemas.openxmlformats.org/wordprocessingml/2006/main">
   <w:body>
     <w:p>
       <w:pPr>
@@ -314,9 +314,16 @@
       </w:r>
     </w:p>
     <w:sectPr>
+      <w:headerReference w:type="default" r:id="rIdHdr1"/>
+      <w:headerReference w:type="first" r:id="rIdHdr2"/>
+      <w:footerReference w:type="default" r:id="rIdFtr1"/>
+      <w:footerReference w:type="first" r:id="rIdFtr2"/>
       <w:footnotePr>
         <w:numRestart w:val="eachSect"/>
       </w:footnotePr>
+      <w:pgSz w:w="11906" w:h="16838"/>
+      <w:pgMar w:top="1134" w:right="1020" w:bottom="1247" w:left="1020" w:header="720" w:footer="720" w:gutter="0"/>
+      <w:titlePg/>
     </w:sectPr>
   </w:body>
 </w:document>
@@ -326,6 +333,174 @@
 <w:comments xmlns:w="http://schemas.openxmlformats.org/wordprocessingml/2006/main" xmlns:m="http://schemas.openxmlformats.org/officeDocument/2006/math" xmlns:r="http://schemas.openxmlformats.org/officeDocument/2006/relationships" xmlns:o="urn:schemas-microsoft-com:office:office" xmlns:v="urn:schemas-microsoft-com:vml" xmlns:w10="urn:schemas-microsoft-com:office:word" xmlns:a="http://schemas.openxmlformats.org/drawingml/2006/main" xmlns:pic="http://schemas.openxmlformats.org/drawingml/2006/picture" xmlns:wp="http://schemas.openxmlformats.org/drawingml/2006/wordprocessingDrawing"/>
 </file>
 
+<file path=word/footer1.xml><?xml version="1.0" encoding="utf-8"?>
+<w:ftr xmlns:w="http://schemas.openxmlformats.org/wordprocessingml/2006/main" xmlns:r="http://schemas.openxmlformats.org/officeDocument/2006/relationships">
+  <w:p>
+    <w:pPr>
+      <w:pStyle w:val="Footer"/>
+      <w:pBdr>
+        <w:top w:val="single" w:sz="4" w:space="4" w:color="E1E4E8"/>
+      </w:pBdr>
+      <w:tabs>
+        <w:tab w:val="clear" w:pos="4680"/>
+        <w:tab w:val="right" w:pos="9360"/>
+      </w:tabs>
+      <w:rPr>
+        <w:sz w:val="18"/>
+        <w:szCs w:val="18"/>
+        <w:color w:val="6A737D"/>
+      </w:rPr>
+    </w:pPr>
+    <w:r>
+      <w:rPr>
+        <w:sz w:val="18"/>
+        <w:szCs w:val="18"/>
+        <w:color w:val="6A737D"/>
+      </w:rPr>
+      <w:fldChar w:fldCharType="begin"/>
+    </w:r>
+    <w:r>
+      <w:rPr>
+        <w:sz w:val="18"/>
+        <w:szCs w:val="18"/>
+        <w:color w:val="6A737D"/>
+      </w:rPr>
+      <w:instrText xml:space="preserve"> TITLE </w:instrText>
+    </w:r>
+    <w:r>
+      <w:rPr>
+        <w:sz w:val="18"/>
+        <w:szCs w:val="18"/>
+        <w:color w:val="6A737D"/>
+      </w:rPr>
+      <w:fldChar w:fldCharType="separate"/>
+    </w:r>
+    <w:r>
+      <w:rPr>
+        <w:sz w:val="18"/>
+        <w:szCs w:val="18"/>
+        <w:color w:val="6A737D"/>
+      </w:rPr>
+      <w:t>Document</w:t>
+    </w:r>
+    <w:r>
+      <w:rPr>
+        <w:sz w:val="18"/>
+        <w:szCs w:val="18"/>
+        <w:color w:val="6A737D"/>
+      </w:rPr>
+      <w:fldChar w:fldCharType="end"/>
+    </w:r>
+    <w:r>
+      <w:rPr>
+        <w:sz w:val="18"/>
+        <w:szCs w:val="18"/>
+        <w:color w:val="6A737D"/>
+      </w:rPr>
+      <w:tab/>
+    </w:r>
+    <w:r>
+      <w:rPr>
+        <w:sz w:val="18"/>
+        <w:szCs w:val="18"/>
+        <w:color w:val="6A737D"/>
+      </w:rPr>
+      <w:fldChar w:fldCharType="begin"/>
+    </w:r>
+    <w:r>
+      <w:rPr>
+        <w:sz w:val="18"/>
+        <w:szCs w:val="18"/>
+        <w:color w:val="6A737D"/>
+      </w:rPr>
+      <w:instrText xml:space="preserve"> PAGE </w:instrText>
+    </w:r>
+    <w:r>
+      <w:rPr>
+        <w:sz w:val="18"/>
+        <w:szCs w:val="18"/>
+        <w:color w:val="6A737D"/>
+      </w:rPr>
+      <w:fldChar w:fldCharType="separate"/>
+    </w:r>
+    <w:r>
+      <w:rPr>
+        <w:sz w:val="18"/>
+        <w:szCs w:val="18"/>
+        <w:color w:val="6A737D"/>
+      </w:rPr>
+      <w:t>1</w:t>
+    </w:r>
+    <w:r>
+      <w:rPr>
+        <w:sz w:val="18"/>
+        <w:szCs w:val="18"/>
+        <w:color w:val="6A737D"/>
+      </w:rPr>
+      <w:fldChar w:fldCharType="end"/>
+    </w:r>
+    <w:r>
+      <w:rPr>
+        <w:sz w:val="18"/>
+        <w:szCs w:val="18"/>
+        <w:color w:val="6A737D"/>
+      </w:rPr>
+      <w:t xml:space="preserve"> / </w:t>
+    </w:r>
+    <w:r>
+      <w:rPr>
+        <w:sz w:val="18"/>
+        <w:szCs w:val="18"/>
+        <w:color w:val="6A737D"/>
+      </w:rPr>
+      <w:fldChar w:fldCharType="begin"/>
+    </w:r>
+    <w:r>
+      <w:rPr>
+        <w:sz w:val="18"/>
+        <w:szCs w:val="18"/>
+        <w:color w:val="6A737D"/>
+      </w:rPr>
+      <w:instrText xml:space="preserve"> NUMPAGES </w:instrText>
+    </w:r>
+    <w:r>
+      <w:rPr>
+        <w:sz w:val="18"/>
+        <w:szCs w:val="18"/>
+        <w:color w:val="6A737D"/>
+      </w:rPr>
+      <w:fldChar w:fldCharType="separate"/>
+    </w:r>
+    <w:r>
+      <w:rPr>
+        <w:sz w:val="18"/>
+        <w:szCs w:val="18"/>
+        <w:color w:val="6A737D"/>
+      </w:rPr>
+      <w:t>1</w:t>
+    </w:r>
+    <w:r>
+      <w:rPr>
+        <w:sz w:val="18"/>
+        <w:szCs w:val="18"/>
+        <w:color w:val="6A737D"/>
+      </w:rPr>
+      <w:fldChar w:fldCharType="end"/>
+    </w:r>
+  </w:p>
+</w:ftr>
+</file>
+
+<file path=word/footer2.xml><?xml version="1.0" encoding="utf-8"?>
+<w:ftr xmlns:w="http://schemas.openxmlformats.org/wordprocessingml/2006/main">
+  <w:p>
+    <w:pPr>
+      <w:pStyle w:val="Footer"/>
+    </w:pPr>
+  </w:p>
+</w:ftr>
+</file>
+
 <file path=word/footnotes.xml><?xml version="1.0" encoding="utf-8"?>
 <w:footnotes xmlns:w="http://schemas.openxmlformats.org/wordprocessingml/2006/main" xmlns:m="http://schemas.openxmlformats.org/officeDocument/2006/math" xmlns:r="http://schemas.openxmlformats.org/officeDocument/2006/relationships" xmlns:o="urn:schemas-microsoft-com:office:office" xmlns:v="urn:schemas-microsoft-com:vml" xmlns:w10="urn:schemas-microsoft-com:office:word" xmlns:a="http://schemas.openxmlformats.org/drawingml/2006/main" xmlns:pic="http://schemas.openxmlformats.org/drawingml/2006/picture" xmlns:wp="http://schemas.openxmlformats.org/drawingml/2006/wordprocessingDrawing">
   <w:footnote w:type="continuationSeparator" w:id="0">
@@ -367,6 +542,74 @@
     </w:p>
   </w:footnote>
 </w:footnotes>
+</file>
+
+<file path=word/header1.xml><?xml version="1.0" encoding="utf-8"?>
+<w:hdr xmlns:w="http://schemas.openxmlformats.org/wordprocessingml/2006/main" xmlns:r="http://schemas.openxmlformats.org/officeDocument/2006/relationships">
+  <w:p>
+    <w:pPr>
+      <w:pStyle w:val="Header"/>
+      <w:pBdr>
+        <w:bottom w:val="single" w:sz="4" w:space="4" w:color="E1E4E8"/>
+      </w:pBdr>
+      <w:rPr>
+        <w:sz w:val="18"/>
+        <w:szCs w:val="18"/>
+        <w:color w:val="6A737D"/>
+      </w:rPr>
+    </w:pPr>
+    <w:r>
+      <w:rPr>
+        <w:sz w:val="18"/>
+        <w:szCs w:val="18"/>
+        <w:color w:val="6A737D"/>
+      </w:rPr>
+      <w:fldChar w:fldCharType="begin"/>
+    </w:r>
+    <w:r>
+      <w:rPr>
+        <w:sz w:val="18"/>
+        <w:szCs w:val="18"/>
+        <w:color w:val="6A737D"/>
+      </w:rPr>
+      <w:instrText xml:space="preserve"> TITLE </w:instrText>
+    </w:r>
+    <w:r>
+      <w:rPr>
+        <w:sz w:val="18"/>
+        <w:szCs w:val="18"/>
+        <w:color w:val="6A737D"/>
+      </w:rPr>
+      <w:fldChar w:fldCharType="separate"/>
+    </w:r>
+    <w:r>
+      <w:rPr>
+        <w:sz w:val="18"/>
+        <w:szCs w:val="18"/>
+        <w:color w:val="6A737D"/>
+      </w:rPr>
+      <w:t>Document</w:t>
+    </w:r>
+    <w:r>
+      <w:rPr>
+        <w:sz w:val="18"/>
+        <w:szCs w:val="18"/>
+        <w:color w:val="6A737D"/>
+      </w:rPr>
+      <w:fldChar w:fldCharType="end"/>
+    </w:r>
+  </w:p>
+</w:hdr>
+</file>
+
+<file path=word/header2.xml><?xml version="1.0" encoding="utf-8"?>
+<w:hdr xmlns:w="http://schemas.openxmlformats.org/wordprocessingml/2006/main">
+  <w:p>
+    <w:pPr>
+      <w:pStyle w:val="Header"/>
+    </w:pPr>
+  </w:p>
+</w:hdr>
 </file>
 
 <file path=word/numbering.xml><?xml version="1.0" encoding="utf-8"?>
@@ -534,14 +777,18 @@
     <w:qFormat/>
     <w:rsid w:val="00A10FD9"/>
     <w:pPr>
-      <w:spacing w:after="80" w:line="240" w:lineRule="auto"/>
-      <w:contextualSpacing/>
       <w:jc w:val="center"/>
-    </w:pPr>
-    <w:rPr>
-      <w:rFonts w:asciiTheme="majorHAnsi" w:eastAsiaTheme="majorEastAsia" w:hAnsiTheme="majorHAnsi" w:cstheme="majorBidi"/>
+      <w:spacing w:before="4000" w:after="200"/>
+      <w:pBdr>
+        <w:bottom w:val="single" w:sz="8" w:space="8" w:color="E1E4E8"/>
+      </w:pBdr>
+    </w:pPr>
+    <w:rPr>
+      <w:b/>
+      <w:bCs/>
       <w:sz w:val="56"/>
       <w:szCs w:val="56"/>
+      <w:color w:val="24292E"/>
     </w:rPr>
   </w:style>
   <w:style w:type="character" w:customStyle="1" w:styleId="TitleChar">
@@ -596,12 +843,13 @@
     <w:next w:val="BodyText"/>
     <w:qFormat/>
     <w:pPr>
-      <w:keepNext/>
-      <w:keepLines/>
-    </w:pPr>
-    <w:rPr>
-      <w:sz w:val="24"/>
-      <w:szCs w:val="24"/>
+      <w:jc w:val="center"/>
+      <w:spacing w:before="200" w:after="100"/>
+    </w:pPr>
+    <w:rPr>
+      <w:sz w:val="28"/>
+      <w:szCs w:val="28"/>
+      <w:color w:val="586069"/>
     </w:rPr>
   </w:style>
   <w:style w:type="paragraph" w:styleId="Date">
@@ -610,12 +858,15 @@
     <w:next w:val="BodyText"/>
     <w:qFormat/>
     <w:pPr>
-      <w:keepNext/>
-      <w:keepLines/>
-    </w:pPr>
-    <w:rPr>
+      <w:jc w:val="center"/>
+      <w:spacing w:before="200" w:after="100"/>
+    </w:pPr>
+    <w:rPr>
+      <w:i/>
+      <w:iCs/>
       <w:sz w:val="24"/>
       <w:szCs w:val="24"/>
+      <w:color w:val="6A737D"/>
     </w:rPr>
   </w:style>
   <w:style w:type="paragraph" w:customStyle="1" w:styleId="AbstractTitle">
@@ -984,9 +1235,15 @@
     <w:unhideWhenUsed/>
     <w:qFormat/>
     <w:pPr>
-      <w:spacing w:before="100" w:after="100"/>
-      <w:ind w:firstLine="0" w:left="480" w:right="480"/>
-    </w:pPr>
+      <w:pBdr>
+        <w:left w:val="single" w:sz="12" w:space="8" w:color="DFE2E5"/>
+      </w:pBdr>
+      <w:ind w:left="360"/>
+      <w:spacing w:before="120" w:after="120"/>
+    </w:pPr>
+    <w:rPr>
+      <w:color w:val="6A737D"/>
+    </w:rPr>
   </w:style>
   <w:style w:type="paragraph" w:styleId="FootnoteText">
     <w:name w:val="Footnote Text"/>
@@ -1113,8 +1370,11 @@
     <w:name w:val="Verbatim Char"/>
     <w:basedOn w:val="BodyTextChar"/>
     <w:rPr>
-      <w:rFonts w:ascii="Consolas" w:hAnsi="Consolas"/>
-      <w:sz w:val="22"/>
+      <w:rFonts w:ascii="Consolas" w:hAnsi="Consolas" w:cs="Courier New"/>
+      <w:sz w:val="20"/>
+      <w:szCs w:val="20"/>
+      <w:shd w:val="clear" w:color="auto" w:fill="F6F8FA"/>
+      <w:bdr w:val="single" w:sz="4" w:space="1" w:color="E1E4E8"/>
     </w:rPr>
   </w:style>
   <w:style w:type="character" w:customStyle="1" w:styleId="SectionNumber">
@@ -1143,53 +1403,35 @@
     <w:unhideWhenUsed/>
     <w:qFormat/>
     <w:pPr>
-      <w:spacing w:before="240" w:line="259" w:lineRule="auto"/>
-      <w:outlineLvl w:val="9"/>
-    </w:pPr>
-    <w:rPr>
-      <w:rFonts w:asciiTheme="majorHAnsi" w:eastAsiaTheme="majorEastAsia" w:hAnsiTheme="majorHAnsi" w:cstheme="majorBidi"/>
-      <w:b w:val="0"/>
-      <w:bCs w:val="0"/>
-      <w:color w:val="365F91" w:themeColor="accent1" w:themeShade="BF"/>
-    </w:rPr>
-  </w:style>
-  <w:style w:type="table" w:styleId="TableGrid">
-    <w:name w:val="Table Grid"/>
-    <w:basedOn w:val="TableNormal"/>
-    <w:tblPr>
-      <w:tblW w:w="5000" w:type="pct"/>
-      <w:tblBorders>
-        <w:top w:val="single" w:sz="4" w:space="0" w:color="E1E4E8"/>
-        <w:left w:val="single" w:sz="4" w:space="0" w:color="E1E4E8"/>
-        <w:bottom w:val="single" w:sz="4" w:space="0" w:color="E1E4E8"/>
-        <w:right w:val="single" w:sz="4" w:space="0" w:color="E1E4E8"/>
-        <w:insideH w:val="single" w:sz="4" w:space="0" w:color="E1E4E8"/>
-        <w:insideV w:val="single" w:sz="4" w:space="0" w:color="E1E4E8"/>
-      </w:tblBorders>
-      <w:tblCellMar>
-        <w:top w:w="80" w:type="dxa"/>
-        <w:left w:w="80" w:type="dxa"/>
-        <w:bottom w:w="80" w:type="dxa"/>
-        <w:right w:w="80" w:type="dxa"/>
-      </w:tblCellMar>
-      <w:tblLook w:val="04A0" w:firstRow="1" w:lastRow="0" w:firstColumn="0" w:lastColumn="0" w:noHBand="0" w:noVBand="1"/>
-    </w:tblPr>
-    <w:tblStylePr w:type="firstRow">
-      <w:rPr>
-        <w:b w:val="1"/>
-      </w:rPr>
-      <w:tcPr>
-        <w:shd w:val="clear" w:color="auto" w:fill="F6F8FA"/>
-        <w:tcBorders>
-          <w:bottom w:val="single" w:sz="8" w:space="0" w:color="E1E4E8"/>
-        </w:tcBorders>
-      </w:tcPr>
-    </w:tblStylePr>
-    <w:tblStylePr w:type="band1Horz">
-      <w:tcPr>
-        <w:shd w:val="clear" w:color="auto" w:fill="F9FAFB"/>
-      </w:tcPr>
-    </w:tblStylePr>
+      <w:spacing w:before="0" w:after="240"/>
+    </w:pPr>
+    <w:rPr>
+      <w:b/>
+      <w:bCs/>
+      <w:sz w:val="32"/>
+      <w:szCs w:val="32"/>
+      <w:color w:val="24292E"/>
+    </w:rPr>
+  </w:style>
+  <w:style w:type="paragraph" w:styleId="SourceCode">
+    <w:name w:val="Source Code"/>
+    <w:basedOn w:val="Normal"/>
+    <w:pPr>
+      <w:shd w:val="clear" w:color="auto" w:fill="F6F8FA"/>
+      <w:pBdr>
+        <w:top w:val="single" w:sz="4" w:space="4" w:color="E1E4E8"/>
+        <w:left w:val="single" w:sz="4" w:space="4" w:color="E1E4E8"/>
+        <w:bottom w:val="single" w:sz="4" w:space="4" w:color="E1E4E8"/>
+        <w:right w:val="single" w:sz="4" w:space="4" w:color="E1E4E8"/>
+      </w:pBdr>
+      <w:spacing w:before="120" w:after="120" w:line="276" w:lineRule="auto"/>
+      <w:keepLines/>
+    </w:pPr>
+    <w:rPr>
+      <w:rFonts w:ascii="Consolas" w:hAnsi="Consolas" w:cs="Courier New"/>
+      <w:sz w:val="20"/>
+      <w:szCs w:val="20"/>
+    </w:rPr>
   </w:style>
 </w:styles>
 </file>

</xml_diff>

<commit_message>
final working version also updated the docker image
</commit_message>
<xml_diff>
--- a/reference.docx
+++ b/reference.docx
@@ -1,6 +1,6 @@
 
 <file path=word/document.xml><?xml version="1.0" encoding="utf-8"?>
-<w:document xmlns:r="http://schemas.openxmlformats.org/officeDocument/2006/relationships" xmlns:w="http://schemas.openxmlformats.org/wordprocessingml/2006/main">
+<w:document xmlns:w="http://schemas.openxmlformats.org/wordprocessingml/2006/main" xmlns:m="http://schemas.openxmlformats.org/officeDocument/2006/math" xmlns:r="http://schemas.openxmlformats.org/officeDocument/2006/relationships" xmlns:o="urn:schemas-microsoft-com:office:office" xmlns:v="urn:schemas-microsoft-com:vml" xmlns:w10="urn:schemas-microsoft-com:office:word" xmlns:a="http://schemas.openxmlformats.org/drawingml/2006/main" xmlns:pic="http://schemas.openxmlformats.org/drawingml/2006/picture" xmlns:wp="http://schemas.openxmlformats.org/drawingml/2006/wordprocessingDrawing">
   <w:body>
     <w:p>
       <w:pPr>
@@ -314,16 +314,13 @@
       </w:r>
     </w:p>
     <w:sectPr>
-      <w:headerReference w:type="default" r:id="rIdHdr1"/>
-      <w:headerReference w:type="first" r:id="rIdHdr2"/>
-      <w:footerReference w:type="default" r:id="rIdFtr1"/>
-      <w:footerReference w:type="first" r:id="rIdFtr2"/>
       <w:footnotePr>
         <w:numRestart w:val="eachSect"/>
       </w:footnotePr>
-      <w:pgSz w:w="11906" w:h="16838"/>
-      <w:pgMar w:top="1134" w:right="1020" w:bottom="1247" w:left="1020" w:header="720" w:footer="720" w:gutter="0"/>
-      <w:titlePg/>
+      <w:pgSz w:w="12240" w:h="15840"/>
+      <w:pgMar w:top="1440" w:right="1440" w:bottom="1440" w:left="1440" w:header="720" w:footer="720" w:gutter="0"/>
+      <w:cols w:space="720"/>
+      <w:docGrid w:linePitch="360"/>
     </w:sectPr>
   </w:body>
 </w:document>
@@ -333,174 +330,6 @@
 <w:comments xmlns:w="http://schemas.openxmlformats.org/wordprocessingml/2006/main" xmlns:m="http://schemas.openxmlformats.org/officeDocument/2006/math" xmlns:r="http://schemas.openxmlformats.org/officeDocument/2006/relationships" xmlns:o="urn:schemas-microsoft-com:office:office" xmlns:v="urn:schemas-microsoft-com:vml" xmlns:w10="urn:schemas-microsoft-com:office:word" xmlns:a="http://schemas.openxmlformats.org/drawingml/2006/main" xmlns:pic="http://schemas.openxmlformats.org/drawingml/2006/picture" xmlns:wp="http://schemas.openxmlformats.org/drawingml/2006/wordprocessingDrawing"/>
 </file>
 
-<file path=word/footer1.xml><?xml version="1.0" encoding="utf-8"?>
-<w:ftr xmlns:w="http://schemas.openxmlformats.org/wordprocessingml/2006/main" xmlns:r="http://schemas.openxmlformats.org/officeDocument/2006/relationships">
-  <w:p>
-    <w:pPr>
-      <w:pStyle w:val="Footer"/>
-      <w:pBdr>
-        <w:top w:val="single" w:sz="4" w:space="4" w:color="E1E4E8"/>
-      </w:pBdr>
-      <w:tabs>
-        <w:tab w:val="clear" w:pos="4680"/>
-        <w:tab w:val="right" w:pos="9360"/>
-      </w:tabs>
-      <w:rPr>
-        <w:sz w:val="18"/>
-        <w:szCs w:val="18"/>
-        <w:color w:val="6A737D"/>
-      </w:rPr>
-    </w:pPr>
-    <w:r>
-      <w:rPr>
-        <w:sz w:val="18"/>
-        <w:szCs w:val="18"/>
-        <w:color w:val="6A737D"/>
-      </w:rPr>
-      <w:fldChar w:fldCharType="begin"/>
-    </w:r>
-    <w:r>
-      <w:rPr>
-        <w:sz w:val="18"/>
-        <w:szCs w:val="18"/>
-        <w:color w:val="6A737D"/>
-      </w:rPr>
-      <w:instrText xml:space="preserve"> TITLE </w:instrText>
-    </w:r>
-    <w:r>
-      <w:rPr>
-        <w:sz w:val="18"/>
-        <w:szCs w:val="18"/>
-        <w:color w:val="6A737D"/>
-      </w:rPr>
-      <w:fldChar w:fldCharType="separate"/>
-    </w:r>
-    <w:r>
-      <w:rPr>
-        <w:sz w:val="18"/>
-        <w:szCs w:val="18"/>
-        <w:color w:val="6A737D"/>
-      </w:rPr>
-      <w:t>Document</w:t>
-    </w:r>
-    <w:r>
-      <w:rPr>
-        <w:sz w:val="18"/>
-        <w:szCs w:val="18"/>
-        <w:color w:val="6A737D"/>
-      </w:rPr>
-      <w:fldChar w:fldCharType="end"/>
-    </w:r>
-    <w:r>
-      <w:rPr>
-        <w:sz w:val="18"/>
-        <w:szCs w:val="18"/>
-        <w:color w:val="6A737D"/>
-      </w:rPr>
-      <w:tab/>
-    </w:r>
-    <w:r>
-      <w:rPr>
-        <w:sz w:val="18"/>
-        <w:szCs w:val="18"/>
-        <w:color w:val="6A737D"/>
-      </w:rPr>
-      <w:fldChar w:fldCharType="begin"/>
-    </w:r>
-    <w:r>
-      <w:rPr>
-        <w:sz w:val="18"/>
-        <w:szCs w:val="18"/>
-        <w:color w:val="6A737D"/>
-      </w:rPr>
-      <w:instrText xml:space="preserve"> PAGE </w:instrText>
-    </w:r>
-    <w:r>
-      <w:rPr>
-        <w:sz w:val="18"/>
-        <w:szCs w:val="18"/>
-        <w:color w:val="6A737D"/>
-      </w:rPr>
-      <w:fldChar w:fldCharType="separate"/>
-    </w:r>
-    <w:r>
-      <w:rPr>
-        <w:sz w:val="18"/>
-        <w:szCs w:val="18"/>
-        <w:color w:val="6A737D"/>
-      </w:rPr>
-      <w:t>1</w:t>
-    </w:r>
-    <w:r>
-      <w:rPr>
-        <w:sz w:val="18"/>
-        <w:szCs w:val="18"/>
-        <w:color w:val="6A737D"/>
-      </w:rPr>
-      <w:fldChar w:fldCharType="end"/>
-    </w:r>
-    <w:r>
-      <w:rPr>
-        <w:sz w:val="18"/>
-        <w:szCs w:val="18"/>
-        <w:color w:val="6A737D"/>
-      </w:rPr>
-      <w:t xml:space="preserve"> / </w:t>
-    </w:r>
-    <w:r>
-      <w:rPr>
-        <w:sz w:val="18"/>
-        <w:szCs w:val="18"/>
-        <w:color w:val="6A737D"/>
-      </w:rPr>
-      <w:fldChar w:fldCharType="begin"/>
-    </w:r>
-    <w:r>
-      <w:rPr>
-        <w:sz w:val="18"/>
-        <w:szCs w:val="18"/>
-        <w:color w:val="6A737D"/>
-      </w:rPr>
-      <w:instrText xml:space="preserve"> NUMPAGES </w:instrText>
-    </w:r>
-    <w:r>
-      <w:rPr>
-        <w:sz w:val="18"/>
-        <w:szCs w:val="18"/>
-        <w:color w:val="6A737D"/>
-      </w:rPr>
-      <w:fldChar w:fldCharType="separate"/>
-    </w:r>
-    <w:r>
-      <w:rPr>
-        <w:sz w:val="18"/>
-        <w:szCs w:val="18"/>
-        <w:color w:val="6A737D"/>
-      </w:rPr>
-      <w:t>1</w:t>
-    </w:r>
-    <w:r>
-      <w:rPr>
-        <w:sz w:val="18"/>
-        <w:szCs w:val="18"/>
-        <w:color w:val="6A737D"/>
-      </w:rPr>
-      <w:fldChar w:fldCharType="end"/>
-    </w:r>
-  </w:p>
-</w:ftr>
-</file>
-
-<file path=word/footer2.xml><?xml version="1.0" encoding="utf-8"?>
-<w:ftr xmlns:w="http://schemas.openxmlformats.org/wordprocessingml/2006/main">
-  <w:p>
-    <w:pPr>
-      <w:pStyle w:val="Footer"/>
-    </w:pPr>
-  </w:p>
-</w:ftr>
-</file>
-
 <file path=word/footnotes.xml><?xml version="1.0" encoding="utf-8"?>
 <w:footnotes xmlns:w="http://schemas.openxmlformats.org/wordprocessingml/2006/main" xmlns:m="http://schemas.openxmlformats.org/officeDocument/2006/math" xmlns:r="http://schemas.openxmlformats.org/officeDocument/2006/relationships" xmlns:o="urn:schemas-microsoft-com:office:office" xmlns:v="urn:schemas-microsoft-com:vml" xmlns:w10="urn:schemas-microsoft-com:office:word" xmlns:a="http://schemas.openxmlformats.org/drawingml/2006/main" xmlns:pic="http://schemas.openxmlformats.org/drawingml/2006/picture" xmlns:wp="http://schemas.openxmlformats.org/drawingml/2006/wordprocessingDrawing">
   <w:footnote w:type="continuationSeparator" w:id="0">
@@ -542,74 +371,6 @@
     </w:p>
   </w:footnote>
 </w:footnotes>
-</file>
-
-<file path=word/header1.xml><?xml version="1.0" encoding="utf-8"?>
-<w:hdr xmlns:w="http://schemas.openxmlformats.org/wordprocessingml/2006/main" xmlns:r="http://schemas.openxmlformats.org/officeDocument/2006/relationships">
-  <w:p>
-    <w:pPr>
-      <w:pStyle w:val="Header"/>
-      <w:pBdr>
-        <w:bottom w:val="single" w:sz="4" w:space="4" w:color="E1E4E8"/>
-      </w:pBdr>
-      <w:rPr>
-        <w:sz w:val="18"/>
-        <w:szCs w:val="18"/>
-        <w:color w:val="6A737D"/>
-      </w:rPr>
-    </w:pPr>
-    <w:r>
-      <w:rPr>
-        <w:sz w:val="18"/>
-        <w:szCs w:val="18"/>
-        <w:color w:val="6A737D"/>
-      </w:rPr>
-      <w:fldChar w:fldCharType="begin"/>
-    </w:r>
-    <w:r>
-      <w:rPr>
-        <w:sz w:val="18"/>
-        <w:szCs w:val="18"/>
-        <w:color w:val="6A737D"/>
-      </w:rPr>
-      <w:instrText xml:space="preserve"> TITLE </w:instrText>
-    </w:r>
-    <w:r>
-      <w:rPr>
-        <w:sz w:val="18"/>
-        <w:szCs w:val="18"/>
-        <w:color w:val="6A737D"/>
-      </w:rPr>
-      <w:fldChar w:fldCharType="separate"/>
-    </w:r>
-    <w:r>
-      <w:rPr>
-        <w:sz w:val="18"/>
-        <w:szCs w:val="18"/>
-        <w:color w:val="6A737D"/>
-      </w:rPr>
-      <w:t>Document</w:t>
-    </w:r>
-    <w:r>
-      <w:rPr>
-        <w:sz w:val="18"/>
-        <w:szCs w:val="18"/>
-        <w:color w:val="6A737D"/>
-      </w:rPr>
-      <w:fldChar w:fldCharType="end"/>
-    </w:r>
-  </w:p>
-</w:hdr>
-</file>
-
-<file path=word/header2.xml><?xml version="1.0" encoding="utf-8"?>
-<w:hdr xmlns:w="http://schemas.openxmlformats.org/wordprocessingml/2006/main">
-  <w:p>
-    <w:pPr>
-      <w:pStyle w:val="Header"/>
-    </w:pPr>
-  </w:p>
-</w:hdr>
 </file>
 
 <file path=word/numbering.xml><?xml version="1.0" encoding="utf-8"?>
@@ -724,7 +485,7 @@
 </file>
 
 <file path=word/styles.xml><?xml version="1.0" encoding="utf-8"?>
-<w:styles xmlns:w="http://schemas.openxmlformats.org/wordprocessingml/2006/main">
+<w:styles xmlns:r="http://schemas.openxmlformats.org/officeDocument/2006/relationships" xmlns:w="http://schemas.openxmlformats.org/wordprocessingml/2006/main">
   <w:docDefaults>
     <w:rPrDefault>
       <w:rPr>
@@ -777,18 +538,14 @@
     <w:qFormat/>
     <w:rsid w:val="00A10FD9"/>
     <w:pPr>
+      <w:spacing w:after="80" w:line="240" w:lineRule="auto"/>
+      <w:contextualSpacing/>
       <w:jc w:val="center"/>
-      <w:spacing w:before="600" w:after="200"/>
-      <w:pBdr>
-        <w:bottom w:val="single" w:sz="8" w:space="8" w:color="E1E4E8"/>
-      </w:pBdr>
-    </w:pPr>
-    <w:rPr>
-      <w:b/>
-      <w:bCs/>
+    </w:pPr>
+    <w:rPr>
+      <w:rFonts w:asciiTheme="majorHAnsi" w:eastAsiaTheme="majorEastAsia" w:hAnsiTheme="majorHAnsi" w:cstheme="majorBidi"/>
       <w:sz w:val="56"/>
       <w:szCs w:val="56"/>
-      <w:color w:val="24292E"/>
     </w:rPr>
   </w:style>
   <w:style w:type="character" w:customStyle="1" w:styleId="TitleChar">
@@ -843,13 +600,12 @@
     <w:next w:val="BodyText"/>
     <w:qFormat/>
     <w:pPr>
-      <w:jc w:val="center"/>
-      <w:spacing w:before="200" w:after="100"/>
-    </w:pPr>
-    <w:rPr>
-      <w:sz w:val="28"/>
-      <w:szCs w:val="28"/>
-      <w:color w:val="586069"/>
+      <w:keepNext/>
+      <w:keepLines/>
+    </w:pPr>
+    <w:rPr>
+      <w:sz w:val="24"/>
+      <w:szCs w:val="24"/>
     </w:rPr>
   </w:style>
   <w:style w:type="paragraph" w:styleId="Date">
@@ -858,15 +614,12 @@
     <w:next w:val="BodyText"/>
     <w:qFormat/>
     <w:pPr>
-      <w:jc w:val="center"/>
-      <w:spacing w:before="200" w:after="100"/>
-    </w:pPr>
-    <w:rPr>
-      <w:i/>
-      <w:iCs/>
+      <w:keepNext/>
+      <w:keepLines/>
+    </w:pPr>
+    <w:rPr>
       <w:sz w:val="24"/>
       <w:szCs w:val="24"/>
-      <w:color w:val="6A737D"/>
     </w:rPr>
   </w:style>
   <w:style w:type="paragraph" w:customStyle="1" w:styleId="AbstractTitle">
@@ -1235,15 +988,9 @@
     <w:unhideWhenUsed/>
     <w:qFormat/>
     <w:pPr>
-      <w:pBdr>
-        <w:left w:val="single" w:sz="12" w:space="8" w:color="DFE2E5"/>
-      </w:pBdr>
-      <w:ind w:left="360"/>
-      <w:spacing w:before="120" w:after="120"/>
-    </w:pPr>
-    <w:rPr>
-      <w:color w:val="6A737D"/>
-    </w:rPr>
+      <w:spacing w:before="100" w:after="100"/>
+      <w:ind w:firstLine="0" w:left="480" w:right="480"/>
+    </w:pPr>
   </w:style>
   <w:style w:type="paragraph" w:styleId="FootnoteText">
     <w:name w:val="Footnote Text"/>
@@ -1277,37 +1024,20 @@
     <w:unhideWhenUsed/>
     <w:qFormat/>
     <w:tblPr>
-      <w:tblW w:w="5000" w:type="pct"/>
-      <w:tblBorders>
-        <w:top w:val="single" w:sz="4" w:space="0" w:color="E1E4E8"/>
-        <w:left w:val="single" w:sz="4" w:space="0" w:color="E1E4E8"/>
-        <w:bottom w:val="single" w:sz="4" w:space="0" w:color="E1E4E8"/>
-        <w:right w:val="single" w:sz="4" w:space="0" w:color="E1E4E8"/>
-        <w:insideH w:val="single" w:sz="4" w:space="0" w:color="E1E4E8"/>
-        <w:insideV w:val="single" w:sz="4" w:space="0" w:color="E1E4E8"/>
-      </w:tblBorders>
+      <w:tblInd w:w="0" w:type="dxa"/>
       <w:tblCellMar>
-        <w:top w:w="100" w:type="dxa"/>
-        <w:left w:w="100" w:type="dxa"/>
-        <w:bottom w:w="100" w:type="dxa"/>
-        <w:right w:w="100" w:type="dxa"/>
+        <w:top w:w="0" w:type="dxa"/>
+        <w:left w:w="108" w:type="dxa"/>
+        <w:bottom w:w="0" w:type="dxa"/>
+        <w:right w:w="108" w:type="dxa"/>
       </w:tblCellMar>
-      <w:tblLook w:val="04A0" w:firstRow="1" w:lastRow="0" w:firstColumn="0" w:lastColumn="0" w:noHBand="0" w:noVBand="1"/>
     </w:tblPr>
     <w:tblStylePr w:type="firstRow">
-      <w:rPr>
-        <w:b w:val="1"/>
-      </w:rPr>
       <w:tcPr>
-        <w:shd w:val="clear" w:color="auto" w:fill="F6F8FA"/>
         <w:tcBorders>
-          <w:bottom w:val="single" w:sz="8" w:space="0" w:color="E1E4E8"/>
+          <w:bottom w:val="single"/>
         </w:tcBorders>
-      </w:tcPr>
-    </w:tblStylePr>
-    <w:tblStylePr w:type="band1Horz">
-      <w:tcPr>
-        <w:shd w:val="clear" w:color="auto" w:fill="F9FAFB"/>
+        <w:vAlign w:val="bottom"/>
       </w:tcPr>
     </w:tblStylePr>
   </w:style>
@@ -1370,11 +1100,8 @@
     <w:name w:val="Verbatim Char"/>
     <w:basedOn w:val="BodyTextChar"/>
     <w:rPr>
-      <w:rFonts w:ascii="Consolas" w:hAnsi="Consolas" w:cs="Courier New"/>
-      <w:sz w:val="20"/>
-      <w:szCs w:val="20"/>
-      <w:shd w:val="clear" w:color="auto" w:fill="F6F8FA"/>
-      <w:bdr w:val="single" w:sz="4" w:space="1" w:color="E1E4E8"/>
+      <w:rFonts w:ascii="Consolas" w:hAnsi="Consolas"/>
+      <w:sz w:val="22"/>
     </w:rPr>
   </w:style>
   <w:style w:type="character" w:customStyle="1" w:styleId="SectionNumber">
@@ -1403,34 +1130,14 @@
     <w:unhideWhenUsed/>
     <w:qFormat/>
     <w:pPr>
-      <w:spacing w:before="0" w:after="240"/>
-    </w:pPr>
-    <w:rPr>
-      <w:b/>
-      <w:bCs/>
-      <w:sz w:val="32"/>
-      <w:szCs w:val="32"/>
-      <w:color w:val="24292E"/>
-    </w:rPr>
-  </w:style>
-  <w:style w:type="paragraph" w:styleId="SourceCode">
-    <w:name w:val="Source Code"/>
-    <w:basedOn w:val="Normal"/>
-    <w:pPr>
-      <w:shd w:val="clear" w:color="auto" w:fill="F6F8FA"/>
-      <w:pBdr>
-        <w:top w:val="single" w:sz="4" w:space="4" w:color="E1E4E8"/>
-        <w:left w:val="single" w:sz="4" w:space="4" w:color="E1E4E8"/>
-        <w:bottom w:val="single" w:sz="4" w:space="4" w:color="E1E4E8"/>
-        <w:right w:val="single" w:sz="4" w:space="4" w:color="E1E4E8"/>
-      </w:pBdr>
-      <w:spacing w:before="120" w:after="120" w:line="276" w:lineRule="auto"/>
-      <w:keepLines/>
-    </w:pPr>
-    <w:rPr>
-      <w:rFonts w:ascii="Consolas" w:hAnsi="Consolas" w:cs="Courier New"/>
-      <w:sz w:val="20"/>
-      <w:szCs w:val="20"/>
+      <w:spacing w:before="240" w:line="259" w:lineRule="auto"/>
+      <w:outlineLvl w:val="9"/>
+    </w:pPr>
+    <w:rPr>
+      <w:rFonts w:asciiTheme="majorHAnsi" w:eastAsiaTheme="majorEastAsia" w:hAnsiTheme="majorHAnsi" w:cstheme="majorBidi"/>
+      <w:b w:val="0"/>
+      <w:bCs w:val="0"/>
+      <w:color w:val="365F91" w:themeColor="accent1" w:themeShade="BF"/>
     </w:rPr>
   </w:style>
 </w:styles>

</xml_diff>